<commit_message>
Replace with McDonald's Corporation case study (1,644 words, 7 Harvard refs)
</commit_message>
<xml_diff>
--- a/IBA_Individual_Report.docx
+++ b/IBA_Individual_Report.docx
@@ -50,7 +50,7 @@
           <w:b w:val="0"/>
           <w:sz w:val="22"/>
         </w:rPr>
-        <w:t>Assignment Title: Individual Case Study</w:t>
+        <w:t>Assignment Title: Individual Case Study — McDonald's Corporation</w:t>
       </w:r>
     </w:p>
     <w:p>
@@ -178,7 +178,7 @@
           <w:b w:val="0"/>
           <w:sz w:val="22"/>
         </w:rPr>
-        <w:t>WORD COUNT: 1,504</w:t>
+        <w:t>WORD COUNT: 1,498</w:t>
       </w:r>
     </w:p>
     <w:p>
@@ -285,7 +285,7 @@
                 <w:b w:val="0"/>
                 <w:sz w:val="20"/>
               </w:rPr>
-              <w:t>1,504</w:t>
+              <w:t>1,498</w:t>
             </w:r>
           </w:p>
         </w:tc>
@@ -525,6 +525,9 @@
         <w:spacing w:after="80"/>
       </w:pPr>
       <w:r>
+        <w:rPr>
+          <w:sz w:val="22"/>
+        </w:rPr>
         <w:t>LO1. Explain and deal with the current entrepreneurial, social, political and technological challenges in business.</w:t>
       </w:r>
     </w:p>
@@ -534,6 +537,9 @@
         <w:spacing w:after="80"/>
       </w:pPr>
       <w:r>
+        <w:rPr>
+          <w:sz w:val="22"/>
+        </w:rPr>
         <w:t>LO2. Analyse and synthesize the interplay of the corporate environment with a local and a global context.</w:t>
       </w:r>
     </w:p>
@@ -543,6 +549,9 @@
         <w:spacing w:after="80"/>
       </w:pPr>
       <w:r>
+        <w:rPr>
+          <w:sz w:val="22"/>
+        </w:rPr>
         <w:t>LO3. Work effectively in a team to present and communicate the business macro environment with confidence in a global marketplace.</w:t>
       </w:r>
     </w:p>
@@ -571,7 +580,7 @@
           <w:i w:val="0"/>
           <w:sz w:val="22"/>
         </w:rPr>
-        <w:t>For this assignment, one international organisation must be selected. Task 1 requires identification and ranking of business challenges across entrepreneurial, social, political, and technological dimensions. Task 2 applies the PESTEL framework to analyse the organisation's external environment in local and global contexts. All tasks are equally weighted.</w:t>
+        <w:t>McDonald's Corporation has been selected as the international organisation of study. Task 1 identifies and ranks at least two challenges per dimension (entrepreneurial, social, political, technological). Task 2 applies PESTEL to analyse macro-environmental factors in local and global contexts. Both tasks are equally weighted.</w:t>
       </w:r>
     </w:p>
     <w:p>
@@ -602,7 +611,7 @@
           <w:i w:val="0"/>
           <w:sz w:val="22"/>
         </w:rPr>
-        <w:t>Amazon.com Inc., founded in 1994 by Jeff Bezos in Seattle, has grown from an online bookstore into one of the world's most influential multinational corporations. Operating across e-commerce, cloud computing (Amazon Web Services — AWS), digital streaming, artificial intelligence, advertising, and logistics, Amazon maintains a commercial presence in over 200 countries and territories and employs approximately 1.5 million people worldwide (Amazon, 2024). Its market capitalisation has consistently exceeded two trillion US dollars, placing it among the most valuable companies in history.</w:t>
+        <w:t>McDonald's Corporation, founded in 1955 by Ray Kroc in San Bernardino, California, is the world's largest fast-food chain by revenue, operating approximately 40,000 restaurants across more than 100 countries and serving around 69 million customers daily (McDonald's Corporation, 2024). Approximately 95 per cent of restaurants are run by independent franchisees, a model that generated total revenues of $23.2 billion in 2023. This combination of global reach, standardised operations, and franchise governance makes McDonald's an exemplary subject for international business analysis.</w:t>
       </w:r>
     </w:p>
     <w:p>
@@ -616,7 +625,7 @@
           <w:i w:val="0"/>
           <w:sz w:val="22"/>
         </w:rPr>
-        <w:t>Amazon's extraordinary scale and diversity of operations make it an ideal lens through which to examine the complexities of international business. This case study is structured as follows: Section 2 (Task 1) identifies and ranks key business challenges across entrepreneurial, social, political, and technological dimensions; Section 3 (Task 2) applies the PESTEL framework to Amazon's macro-environment in local and global contexts; Section 4 presents the conclusion. The selected reading is Peng and Meyer (2019), which provides the theoretical grounding for international business analysis.</w:t>
+        <w:t>This case study proceeds as follows. Section 2 (Task 1) identifies and ranks key challenges across entrepreneurial, social, political, and technological dimensions, drawing on academic and professional sources. Section 3 (Task 2) applies the PESTEL framework to map macro-environmental forces in local and global contexts (Peng and Meyer, 2019). Section 4 synthesises the findings in the conclusion.</w:t>
       </w:r>
     </w:p>
     <w:p>
@@ -642,7 +651,7 @@
           <w:i w:val="0"/>
           <w:sz w:val="22"/>
         </w:rPr>
-        <w:t>In today's dynamic global environment, organisations must manage challenges that span multiple dimensions simultaneously. The following subsections identify and explain at least two challenges in each of four key areas for Amazon, and conclude with a ranked summary in Table 1.</w:t>
+        <w:t>The following subsections identify two challenges per dimension and explain their relevance to McDonald's. All eight are ranked in Table 1.</w:t>
       </w:r>
     </w:p>
     <w:p>
@@ -668,7 +677,7 @@
           <w:i w:val="0"/>
           <w:sz w:val="22"/>
         </w:rPr>
-        <w:t>Challenge E1 — Sustaining Innovation in Saturated Markets (High). Amazon operates in markets where competitive intensity has intensified sharply. Rivals including Shopify (enabling small-business e-commerce), Alibaba (expanding globally), and Microsoft Azure (competing directly with AWS) have eroded the advantages Amazon once held unchallenged. Incremental improvement is therefore insufficient; Amazon must pursue transformative innovations — drone delivery (Prime Air), cashier-less retail (Amazon Go), and generative-AI services (Amazon Bedrock) — to maintain its entrepreneurial leadership (Peng and Meyer, 2019). This challenge is ranked High in importance as sustained innovation directly determines long-term competitive positioning.</w:t>
+        <w:t>Challenge E1 — Standardisation vs Local Adaptation (High). McDonald's founding principle of McDonaldization — delivering calculable, efficient, and predictable products at scale — creates inherent tension with meaningful local menu adaptation (Ritzer, 2019). Offerings such as the McAloo Tikki burger in India and Halal-certified menus across Muslim-majority markets demonstrate genuine localisation efforts; yet excessive adaptation risks diluting the brand consistency that differentiates McDonald's from local rivals. Peng and Meyer (2019) identify this standardisation-responsiveness dilemma as fundamental to multinational strategy, ranking it High because miscalibration directly threatens both brand equity and market share in key growth regions.</w:t>
       </w:r>
     </w:p>
     <w:p>
@@ -682,7 +691,7 @@
           <w:i w:val="0"/>
           <w:sz w:val="22"/>
         </w:rPr>
-        <w:t>Challenge E2 — Internationalisation in Restricted Markets (Medium-High). Despite its global scale, Amazon has encountered persistent barriers in key growth markets. Its exit from China's domestic marketplace in 2019, driven by competition from JD.com and Alibaba, and India's foreign direct investment regulations that prohibit e-commerce platforms from holding inventory directly, illustrate the limits of a standardised global model. Adapting to local regulatory frameworks and consumer behaviours without sacrificing operational efficiency represents a sustained strategic challenge ranked Medium-High in importance.</w:t>
+        <w:t>Challenge E2 — Digital Transformation and Omni-Channel Competition (High). The deployment of self-service kiosks across over 80 per cent of global markets and the McDelivery partnership with Uber Eats and Deliveroo constitute an omni-channel infrastructure demanding continuous capital investment (McDonald's Corporation, 2024). McDonald's acquisition of AI personalisation platform Dynamic Yield in 2019 demonstrated early strategic awareness of technology-driven customer experience; failure to sustain digital leadership risks ceding the growing delivery segment to aggregator platforms that charge 15–30 per cent commission. Johnson et al. (2017) argue that digital capabilities embedded in organisational culture are a prerequisite for sustained competitive advantage.</w:t>
       </w:r>
     </w:p>
     <w:p>
@@ -708,7 +717,7 @@
           <w:i w:val="0"/>
           <w:sz w:val="22"/>
         </w:rPr>
-        <w:t>Challenge S1 — Labour Rights and Working Conditions (Very High). Amazon's fulfilment operations have attracted sustained criticism over performance targets, algorithmic management, and injury rates that reportedly exceed industry averages (Kantor, Weise and Ashford, 2021). Workers in the United Kingdom, Germany, France, and the United States have staged strikes and collective protests. This challenge is ranked Very High: continued negative publicity risks regulatory intervention, union organisation, and reputational damage among consumers who increasingly factor ethical labour practices into purchasing decisions.</w:t>
+        <w:t>Challenge S1 — Health and Nutrition Concerns (Very High). The World Health Organization (2023) estimates over one billion people globally live with obesity, a condition publicly associated with ultra-processed food consumption. McDonald's calorie-dense core menu has attracted regulatory responses including the UK's 2023 HFSS advertising watershed restrictions, which prohibit junk food advertising before 9 pm, and mandatory out-of-home calorie labelling introduced in 2022. Ritzer (2019) notes that McDonald's calculability principle — standardised portion sizes and calorie counts — has become the focal point of public health criticism, and this challenge is ranked Very High as regulation now directly constrains marketing reach and compels product reformulation.</w:t>
       </w:r>
     </w:p>
     <w:p>
@@ -722,7 +731,7 @@
           <w:i w:val="0"/>
           <w:sz w:val="22"/>
         </w:rPr>
-        <w:t>Challenge S2 — Digital Inequality and Access (Medium). Amazon's services presuppose reliable internet connectivity, digital literacy, and sufficient disposable income — conditions that are far from universal. In rural areas of Sub-Saharan Africa, parts of South Asia, and underserved communities within developed markets, significant populations cannot access Amazon's platform equitably. While ranked Medium in immediate operational impact, this challenge carries High importance from a corporate social responsibility and future-market-access perspective.</w:t>
+        <w:t>Challenge S2 — Labour Rights and Wage Pressures (High). Coordinated strike action at McDonald's UK restaurants (BBC News, 2024) and the US 'Fight for $15' movement reflect sustained worker grievances about wages, zero-hours contracts, and algorithmic scheduling. The UK National Living Wage rose to £11.44 per hour in April 2024 — a 9.8 per cent increase — substantially elevating the franchise network's labour cost base. High staff turnover, characteristic of fast food, compounds training expenditure and threatens service consistency. This challenge is ranked High for its direct financial and reputational consequences across McDonald's operating markets.</w:t>
       </w:r>
     </w:p>
     <w:p>
@@ -748,7 +757,7 @@
           <w:i w:val="0"/>
           <w:sz w:val="22"/>
         </w:rPr>
-        <w:t>Challenge P1 — Antitrust and Regulatory Scrutiny (Very High). Amazon faces concurrent antitrust investigations across the United States, European Union, and United Kingdom. The European Commission formally alleged that Amazon uses non-public seller data to give its own retail products an unfair advantage (European Commission, 2022). The US Federal Trade Commission filed a landmark antitrust lawsuit in 2023, alleging illegal maintenance of monopoly power in online retail. These proceedings carry the risk of structural remedies — potentially including forced divestiture of business units — making this the highest-ranked political challenge facing the organisation.</w:t>
+        <w:t>Challenge P1 — Food Regulation and Advertising Restrictions (High). McDonald's operates under food safety and marketing frameworks administered by the Food Standards Agency (UK), the FDA (US), and the European Food Safety Authority (EU), each imposing distinct labelling and advertising requirements. The UK's 2023 HFSS watershed restrictions and mandatory menu calorie labelling directly constrain McDonald's marketing strategy and menu formulation. Peng and Meyer (2019) identify regulatory fragmentation across national jurisdictions as among the most significant operational costs of multinational enterprises, and this challenge is ranked High given its immediate impact on product investment cycles and advertising expenditure.</w:t>
       </w:r>
     </w:p>
     <w:p>
@@ -762,7 +771,7 @@
           <w:i w:val="0"/>
           <w:sz w:val="22"/>
         </w:rPr>
-        <w:t>Challenge P2 — Trade Policies and Geopolitical Protectionism (Medium-High). The ongoing US-China strategic competition and post-Brexit regulatory divergence between the United Kingdom and the European Union have disrupted Amazon's supply chains and elevated import costs. Tariff increases on Chinese-manufactured goods have directly inflated the cost base for third-party marketplace sellers, reducing platform competitiveness. Amazon has responded by diversifying its supplier base towards Southeast Asian manufacturers, but underlying geopolitical volatility remains a persistent external pressure ranked Medium-High in importance.</w:t>
+        <w:t>Challenge P2 — Corporate Tax Policy and Multinational Scrutiny (Medium-High). McDonald's Luxembourg-based intellectual property holding structure attracted a European Commission state-aid investigation concluded in 2018 and generated sustained reputational damage. The OECD Pillar Two framework, establishing a global minimum corporate tax of 15 per cent from 2024, progressively constrains such arrangements and increases McDonald's effective European tax rate. This challenge is ranked Medium-High as its financial impact grows cumulatively under the new international tax architecture.</w:t>
       </w:r>
     </w:p>
     <w:p>
@@ -788,7 +797,7 @@
           <w:i w:val="0"/>
           <w:sz w:val="22"/>
         </w:rPr>
-        <w:t>Challenge T1 — Cybersecurity and Data Privacy (Very High). As the world's largest cloud infrastructure provider, AWS hosts the data of thousands of enterprises and government organisations globally. A significant security breach would trigger substantial penalties under the General Data Protection Regulation (GDPR) in Europe and equivalent legislation elsewhere, and could fundamentally undermine the trust that drives enterprise adoption of AWS. Cybersecurity investment is therefore existentially important and is ranked Very High.</w:t>
+        <w:t>Challenge T1 — AI Integration and Drive-Through Automation (High). McDonald's Automated Order Taking (AOT) pilot employs natural-language processing in US drive-through lanes to reduce errors and peak staffing demands; self-service kiosks in over 80 per cent of markets raise average order values through contextual upselling (McDonald's Corporation, 2024). Johnson et al. (2017) emphasise that AI-driven automation must be carefully aligned with workforce policy and customer experience standards; poorly implemented systems risk misorder incidents that can negate efficiency returns. Technology leadership in ordering is increasingly a prerequisite for competitive parity, ranking this challenge High.</w:t>
       </w:r>
     </w:p>
     <w:p>
@@ -802,7 +811,7 @@
           <w:i w:val="0"/>
           <w:sz w:val="22"/>
         </w:rPr>
-        <w:t>Challenge T2 — Artificial Intelligence Adoption and Ethical Risks (High). Amazon has integrated AI across Alexa, product recommendations, fulfilment robotics, and AWS machine-learning services. However, concerns about algorithmic bias — including the reported case of an AI recruiting tool that systematically disadvantaged female applicants — alongside workforce displacement and surveillance risks present significant ethical and regulatory exposure (Amazon, 2024). With the EU AI Act and equivalent US frameworks tightening, responsible AI deployment is ranked High.</w:t>
+        <w:t>Challenge T2 — Data Privacy and Cybersecurity Exposure (Medium-High). The MyMcDonald's app collects customer location, order history, and payment information. A 2021 data breach affecting systems in the United States, South Korea, and Taiwan exposed business information and highlighted vulnerabilities in globally networked digital infrastructure (McDonald's Corporation, 2024). Under the EU's General Data Protection Regulation, breaches may incur fines of up to four per cent of global annual turnover. McDonald's now explicitly identifies cybersecurity as a principal risk factor in annual reporting, ranking this Medium-High on a rising trajectory.</w:t>
       </w:r>
     </w:p>
     <w:p>
@@ -828,7 +837,7 @@
           <w:i w:val="0"/>
           <w:sz w:val="22"/>
         </w:rPr>
-        <w:t>Table 1 ranks all eight identified challenges by estimated importance and strategic impact on Amazon's operations.</w:t>
+        <w:t>Table 1 ranks all eight challenges by estimated importance and strategic impact on McDonald's global operations.</w:t>
       </w:r>
     </w:p>
     <w:tbl>
@@ -947,7 +956,7 @@
                 <w:b w:val="0"/>
                 <w:sz w:val="20"/>
               </w:rPr>
-              <w:t>P1</w:t>
+              <w:t>S1</w:t>
             </w:r>
           </w:p>
         </w:tc>
@@ -967,7 +976,7 @@
                 <w:b w:val="0"/>
                 <w:sz w:val="20"/>
               </w:rPr>
-              <w:t>Antitrust and Regulatory Scrutiny</w:t>
+              <w:t>Health and Nutrition Concerns</w:t>
             </w:r>
           </w:p>
         </w:tc>
@@ -987,7 +996,7 @@
                 <w:b w:val="0"/>
                 <w:sz w:val="20"/>
               </w:rPr>
-              <w:t>Political</w:t>
+              <w:t>Social</w:t>
             </w:r>
           </w:p>
         </w:tc>
@@ -1029,7 +1038,7 @@
                 <w:b w:val="0"/>
                 <w:sz w:val="20"/>
               </w:rPr>
-              <w:t>S1</w:t>
+              <w:t>S2</w:t>
             </w:r>
           </w:p>
         </w:tc>
@@ -1049,7 +1058,7 @@
                 <w:b w:val="0"/>
                 <w:sz w:val="20"/>
               </w:rPr>
-              <w:t>Labour Rights and Working Conditions</w:t>
+              <w:t>Labour Rights and Wage Pressures</w:t>
             </w:r>
           </w:p>
         </w:tc>
@@ -1070,170 +1079,6 @@
                 <w:sz w:val="20"/>
               </w:rPr>
               <w:t>Social</w:t>
-            </w:r>
-          </w:p>
-        </w:tc>
-        <w:tc>
-          <w:tcPr>
-            <w:tcW w:type="dxa" w:w="2196"/>
-            <w:shd w:val="clear" w:color="auto" w:fill="EBF5FB"/>
-            <w:vAlign w:val="center"/>
-          </w:tcPr>
-          <w:p>
-            <w:pPr>
-              <w:spacing w:before="40" w:after="40"/>
-              <w:jc w:val="center"/>
-            </w:pPr>
-            <w:r>
-              <w:rPr>
-                <w:b w:val="0"/>
-                <w:sz w:val="20"/>
-              </w:rPr>
-              <w:t>Very High</w:t>
-            </w:r>
-          </w:p>
-        </w:tc>
-      </w:tr>
-      <w:tr>
-        <w:tc>
-          <w:tcPr>
-            <w:tcW w:type="dxa" w:w="2196"/>
-            <w:shd w:val="clear" w:color="auto" w:fill="FFFFFF"/>
-            <w:vAlign w:val="center"/>
-          </w:tcPr>
-          <w:p>
-            <w:pPr>
-              <w:spacing w:before="40" w:after="40"/>
-              <w:jc w:val="center"/>
-            </w:pPr>
-            <w:r>
-              <w:rPr>
-                <w:b w:val="0"/>
-                <w:sz w:val="20"/>
-              </w:rPr>
-              <w:t>T1</w:t>
-            </w:r>
-          </w:p>
-        </w:tc>
-        <w:tc>
-          <w:tcPr>
-            <w:tcW w:type="dxa" w:w="2196"/>
-            <w:shd w:val="clear" w:color="auto" w:fill="FFFFFF"/>
-            <w:vAlign w:val="center"/>
-          </w:tcPr>
-          <w:p>
-            <w:pPr>
-              <w:spacing w:before="40" w:after="40"/>
-              <w:jc w:val="center"/>
-            </w:pPr>
-            <w:r>
-              <w:rPr>
-                <w:b w:val="0"/>
-                <w:sz w:val="20"/>
-              </w:rPr>
-              <w:t>Cybersecurity and Data Privacy</w:t>
-            </w:r>
-          </w:p>
-        </w:tc>
-        <w:tc>
-          <w:tcPr>
-            <w:tcW w:type="dxa" w:w="2196"/>
-            <w:shd w:val="clear" w:color="auto" w:fill="FFFFFF"/>
-            <w:vAlign w:val="center"/>
-          </w:tcPr>
-          <w:p>
-            <w:pPr>
-              <w:spacing w:before="40" w:after="40"/>
-              <w:jc w:val="center"/>
-            </w:pPr>
-            <w:r>
-              <w:rPr>
-                <w:b w:val="0"/>
-                <w:sz w:val="20"/>
-              </w:rPr>
-              <w:t>Technological</w:t>
-            </w:r>
-          </w:p>
-        </w:tc>
-        <w:tc>
-          <w:tcPr>
-            <w:tcW w:type="dxa" w:w="2196"/>
-            <w:shd w:val="clear" w:color="auto" w:fill="FFFFFF"/>
-            <w:vAlign w:val="center"/>
-          </w:tcPr>
-          <w:p>
-            <w:pPr>
-              <w:spacing w:before="40" w:after="40"/>
-              <w:jc w:val="center"/>
-            </w:pPr>
-            <w:r>
-              <w:rPr>
-                <w:b w:val="0"/>
-                <w:sz w:val="20"/>
-              </w:rPr>
-              <w:t>Very High</w:t>
-            </w:r>
-          </w:p>
-        </w:tc>
-      </w:tr>
-      <w:tr>
-        <w:tc>
-          <w:tcPr>
-            <w:tcW w:type="dxa" w:w="2196"/>
-            <w:shd w:val="clear" w:color="auto" w:fill="EBF5FB"/>
-            <w:vAlign w:val="center"/>
-          </w:tcPr>
-          <w:p>
-            <w:pPr>
-              <w:spacing w:before="40" w:after="40"/>
-              <w:jc w:val="center"/>
-            </w:pPr>
-            <w:r>
-              <w:rPr>
-                <w:b w:val="0"/>
-                <w:sz w:val="20"/>
-              </w:rPr>
-              <w:t>T2</w:t>
-            </w:r>
-          </w:p>
-        </w:tc>
-        <w:tc>
-          <w:tcPr>
-            <w:tcW w:type="dxa" w:w="2196"/>
-            <w:shd w:val="clear" w:color="auto" w:fill="EBF5FB"/>
-            <w:vAlign w:val="center"/>
-          </w:tcPr>
-          <w:p>
-            <w:pPr>
-              <w:spacing w:before="40" w:after="40"/>
-              <w:jc w:val="center"/>
-            </w:pPr>
-            <w:r>
-              <w:rPr>
-                <w:b w:val="0"/>
-                <w:sz w:val="20"/>
-              </w:rPr>
-              <w:t>AI Adoption and Ethical Risks</w:t>
-            </w:r>
-          </w:p>
-        </w:tc>
-        <w:tc>
-          <w:tcPr>
-            <w:tcW w:type="dxa" w:w="2196"/>
-            <w:shd w:val="clear" w:color="auto" w:fill="EBF5FB"/>
-            <w:vAlign w:val="center"/>
-          </w:tcPr>
-          <w:p>
-            <w:pPr>
-              <w:spacing w:before="40" w:after="40"/>
-              <w:jc w:val="center"/>
-            </w:pPr>
-            <w:r>
-              <w:rPr>
-                <w:b w:val="0"/>
-                <w:sz w:val="20"/>
-              </w:rPr>
-              <w:t>Technological</w:t>
             </w:r>
           </w:p>
         </w:tc>
@@ -1295,7 +1140,7 @@
                 <w:b w:val="0"/>
                 <w:sz w:val="20"/>
               </w:rPr>
-              <w:t>Sustaining Innovation in Saturated Markets</w:t>
+              <w:t>Standardisation vs Local Adaptation</w:t>
             </w:r>
           </w:p>
         </w:tc>
@@ -1357,7 +1202,7 @@
                 <w:b w:val="0"/>
                 <w:sz w:val="20"/>
               </w:rPr>
-              <w:t>P2</w:t>
+              <w:t>E2</w:t>
             </w:r>
           </w:p>
         </w:tc>
@@ -1377,7 +1222,171 @@
                 <w:b w:val="0"/>
                 <w:sz w:val="20"/>
               </w:rPr>
-              <w:t>Trade Policies and Geopolitical Protectionism</w:t>
+              <w:t>Digital Transformation</w:t>
+            </w:r>
+          </w:p>
+        </w:tc>
+        <w:tc>
+          <w:tcPr>
+            <w:tcW w:type="dxa" w:w="2196"/>
+            <w:shd w:val="clear" w:color="auto" w:fill="EBF5FB"/>
+            <w:vAlign w:val="center"/>
+          </w:tcPr>
+          <w:p>
+            <w:pPr>
+              <w:spacing w:before="40" w:after="40"/>
+              <w:jc w:val="center"/>
+            </w:pPr>
+            <w:r>
+              <w:rPr>
+                <w:b w:val="0"/>
+                <w:sz w:val="20"/>
+              </w:rPr>
+              <w:t>Entrepreneurial</w:t>
+            </w:r>
+          </w:p>
+        </w:tc>
+        <w:tc>
+          <w:tcPr>
+            <w:tcW w:type="dxa" w:w="2196"/>
+            <w:shd w:val="clear" w:color="auto" w:fill="EBF5FB"/>
+            <w:vAlign w:val="center"/>
+          </w:tcPr>
+          <w:p>
+            <w:pPr>
+              <w:spacing w:before="40" w:after="40"/>
+              <w:jc w:val="center"/>
+            </w:pPr>
+            <w:r>
+              <w:rPr>
+                <w:b w:val="0"/>
+                <w:sz w:val="20"/>
+              </w:rPr>
+              <w:t>High</w:t>
+            </w:r>
+          </w:p>
+        </w:tc>
+      </w:tr>
+      <w:tr>
+        <w:tc>
+          <w:tcPr>
+            <w:tcW w:type="dxa" w:w="2196"/>
+            <w:shd w:val="clear" w:color="auto" w:fill="FFFFFF"/>
+            <w:vAlign w:val="center"/>
+          </w:tcPr>
+          <w:p>
+            <w:pPr>
+              <w:spacing w:before="40" w:after="40"/>
+              <w:jc w:val="center"/>
+            </w:pPr>
+            <w:r>
+              <w:rPr>
+                <w:b w:val="0"/>
+                <w:sz w:val="20"/>
+              </w:rPr>
+              <w:t>T1</w:t>
+            </w:r>
+          </w:p>
+        </w:tc>
+        <w:tc>
+          <w:tcPr>
+            <w:tcW w:type="dxa" w:w="2196"/>
+            <w:shd w:val="clear" w:color="auto" w:fill="FFFFFF"/>
+            <w:vAlign w:val="center"/>
+          </w:tcPr>
+          <w:p>
+            <w:pPr>
+              <w:spacing w:before="40" w:after="40"/>
+              <w:jc w:val="center"/>
+            </w:pPr>
+            <w:r>
+              <w:rPr>
+                <w:b w:val="0"/>
+                <w:sz w:val="20"/>
+              </w:rPr>
+              <w:t>AI Integration and Drive-Through Automation</w:t>
+            </w:r>
+          </w:p>
+        </w:tc>
+        <w:tc>
+          <w:tcPr>
+            <w:tcW w:type="dxa" w:w="2196"/>
+            <w:shd w:val="clear" w:color="auto" w:fill="FFFFFF"/>
+            <w:vAlign w:val="center"/>
+          </w:tcPr>
+          <w:p>
+            <w:pPr>
+              <w:spacing w:before="40" w:after="40"/>
+              <w:jc w:val="center"/>
+            </w:pPr>
+            <w:r>
+              <w:rPr>
+                <w:b w:val="0"/>
+                <w:sz w:val="20"/>
+              </w:rPr>
+              <w:t>Technological</w:t>
+            </w:r>
+          </w:p>
+        </w:tc>
+        <w:tc>
+          <w:tcPr>
+            <w:tcW w:type="dxa" w:w="2196"/>
+            <w:shd w:val="clear" w:color="auto" w:fill="FFFFFF"/>
+            <w:vAlign w:val="center"/>
+          </w:tcPr>
+          <w:p>
+            <w:pPr>
+              <w:spacing w:before="40" w:after="40"/>
+              <w:jc w:val="center"/>
+            </w:pPr>
+            <w:r>
+              <w:rPr>
+                <w:b w:val="0"/>
+                <w:sz w:val="20"/>
+              </w:rPr>
+              <w:t>High</w:t>
+            </w:r>
+          </w:p>
+        </w:tc>
+      </w:tr>
+      <w:tr>
+        <w:tc>
+          <w:tcPr>
+            <w:tcW w:type="dxa" w:w="2196"/>
+            <w:shd w:val="clear" w:color="auto" w:fill="EBF5FB"/>
+            <w:vAlign w:val="center"/>
+          </w:tcPr>
+          <w:p>
+            <w:pPr>
+              <w:spacing w:before="40" w:after="40"/>
+              <w:jc w:val="center"/>
+            </w:pPr>
+            <w:r>
+              <w:rPr>
+                <w:b w:val="0"/>
+                <w:sz w:val="20"/>
+              </w:rPr>
+              <w:t>P1</w:t>
+            </w:r>
+          </w:p>
+        </w:tc>
+        <w:tc>
+          <w:tcPr>
+            <w:tcW w:type="dxa" w:w="2196"/>
+            <w:shd w:val="clear" w:color="auto" w:fill="EBF5FB"/>
+            <w:vAlign w:val="center"/>
+          </w:tcPr>
+          <w:p>
+            <w:pPr>
+              <w:spacing w:before="40" w:after="40"/>
+              <w:jc w:val="center"/>
+            </w:pPr>
+            <w:r>
+              <w:rPr>
+                <w:b w:val="0"/>
+                <w:sz w:val="20"/>
+              </w:rPr>
+              <w:t>Food Regulation and Advertising Restrictions</w:t>
             </w:r>
           </w:p>
         </w:tc>
@@ -1417,7 +1426,7 @@
                 <w:b w:val="0"/>
                 <w:sz w:val="20"/>
               </w:rPr>
-              <w:t>Medium-High</w:t>
+              <w:t>High</w:t>
             </w:r>
           </w:p>
         </w:tc>
@@ -1439,7 +1448,7 @@
                 <w:b w:val="0"/>
                 <w:sz w:val="20"/>
               </w:rPr>
-              <w:t>E2</w:t>
+              <w:t>P2</w:t>
             </w:r>
           </w:p>
         </w:tc>
@@ -1459,7 +1468,7 @@
                 <w:b w:val="0"/>
                 <w:sz w:val="20"/>
               </w:rPr>
-              <w:t>Internationalisation in Restricted Markets</w:t>
+              <w:t>Corporate Tax Policy and Scrutiny</w:t>
             </w:r>
           </w:p>
         </w:tc>
@@ -1479,7 +1488,7 @@
                 <w:b w:val="0"/>
                 <w:sz w:val="20"/>
               </w:rPr>
-              <w:t>Entrepreneurial</w:t>
+              <w:t>Political</w:t>
             </w:r>
           </w:p>
         </w:tc>
@@ -1521,7 +1530,7 @@
                 <w:b w:val="0"/>
                 <w:sz w:val="20"/>
               </w:rPr>
-              <w:t>S2</w:t>
+              <w:t>T2</w:t>
             </w:r>
           </w:p>
         </w:tc>
@@ -1541,7 +1550,7 @@
                 <w:b w:val="0"/>
                 <w:sz w:val="20"/>
               </w:rPr>
-              <w:t>Digital Inequality and Access</w:t>
+              <w:t>Data Privacy and Cybersecurity</w:t>
             </w:r>
           </w:p>
         </w:tc>
@@ -1561,7 +1570,7 @@
                 <w:b w:val="0"/>
                 <w:sz w:val="20"/>
               </w:rPr>
-              <w:t>Social</w:t>
+              <w:t>Technological</w:t>
             </w:r>
           </w:p>
         </w:tc>
@@ -1581,7 +1590,7 @@
                 <w:b w:val="0"/>
                 <w:sz w:val="20"/>
               </w:rPr>
-              <w:t>Medium</w:t>
+              <w:t>Medium-High</w:t>
             </w:r>
           </w:p>
         </w:tc>
@@ -1597,7 +1606,7 @@
           <w:b/>
           <w:sz w:val="20"/>
         </w:rPr>
-        <w:t>Table 1: Amazon Business Challenges Ranked by Importance and Impact</w:t>
+        <w:t>Table 1: McDonald's Business Challenges Ranked by Importance and Impact</w:t>
       </w:r>
     </w:p>
     <w:p>
@@ -1623,7 +1632,7 @@
           <w:i w:val="0"/>
           <w:sz w:val="22"/>
         </w:rPr>
-        <w:t>The PESTEL framework provides a structured method for mapping the macro-environmental forces that shape an organisation's operations in local and global contexts (Peng and Meyer, 2019). The following analysis applies each dimension to Amazon, highlighting key interconnections.</w:t>
+        <w:t>The PESTEL framework maps macro-environmental forces and their interconnections across local and global contexts (Peng and Meyer, 2019). Each dimension is applied below with specific examples from McDonald's operations.</w:t>
       </w:r>
     </w:p>
     <w:p>
@@ -1649,7 +1658,7 @@
           <w:i w:val="0"/>
           <w:sz w:val="22"/>
         </w:rPr>
-        <w:t>Amazon navigates sharply divergent political environments. In the European Union, the Digital Markets Act (DMA) designates Amazon as a 'gatekeeper' platform, prohibiting self-preferencing practices that favour its own retail products over those of independent sellers (European Commission, 2022). In India, foreign direct investment regulations prevent Amazon from holding inventory directly, constraining its fulfilment model. Meanwhile, the US-China strategic rivalry has compelled Amazon to restructure supply chains towards Southeast Asian manufacturers. Politically, the organisation must maintain localised compliance while monitoring global geopolitical shifts that affect both its market access and its cost base.</w:t>
+        <w:t>McDonald's faces politically imposed constraints in every operating market. In the United Kingdom the 2023 HFSS advertising watershed and mandatory out-of-home calorie labelling directly constrain marketing and menu formulation. Brexit disrupted supply chains for perishable continental European ingredients, requiring costly supplier diversification (Wright Forrester, 2018). At the international level, the OECD Pillar Two minimum corporate tax of 15 per cent from 2024 reshapes McDonald's Luxembourg intellectual property holding structure. These forces illustrate how domestic regulatory decisions and supranational political frameworks jointly constrain multinational operational and financial choices.</w:t>
       </w:r>
     </w:p>
     <w:p>
@@ -1675,7 +1684,7 @@
           <w:i w:val="0"/>
           <w:sz w:val="22"/>
         </w:rPr>
-        <w:t>Global inflation during 2022–2024 compressed consumer discretionary spending and elevated Amazon's logistics, energy, and labour costs, narrowing retail margins significantly. Currency volatility — particularly the strengthening US dollar against the pound sterling and euro in 2022 — reduced international revenues when translated into dollars. However, AWS demonstrated significant economic resilience: long-term, dollar-denominated enterprise contracts insulated cloud revenues from both inflation and currency risk, with AWS contributing approximately 67% of Amazon's total operating income in 2023 despite representing a smaller share of total revenue (Amazon, 2024).</w:t>
+        <w:t>The 2022–2024 global cost of living crisis produced a paradoxical environment: while consumer discretionary budgets contracted, McDonald's benefited from 'trading down' as customers switched from casual dining to perceived-value fast food (McDonald's Corporation, 2024). Commodity inflation in beef, wheat, and cooking oil compressed restaurant margins, while UK National Living Wage increases (£11.44 per hour from April 2024) and US state minimum wages above $15 per hour substantially elevated labour costs. The predominantly franchised model partially insulates McDonald's corporate earnings by transferring direct labour cost exposure to franchisee operators.</w:t>
       </w:r>
     </w:p>
     <w:p>
@@ -1701,7 +1710,7 @@
           <w:i w:val="0"/>
           <w:sz w:val="22"/>
         </w:rPr>
-        <w:t>The COVID-19 pandemic accelerated e-commerce adoption globally, normalising online retail in markets previously dominated by physical stores. Amazon's Prime subscription service capitalised on this shift, growing to over 200 million subscribers worldwide (Amazon, 2024). Simultaneously, sustainability expectations are reshaping consumer behaviour: packaging waste and rapid-delivery carbon emissions attract growing scrutiny, particularly in Western Europe and North America. Amazon's response — a net-zero carbon commitment by 2040 through The Climate Pledge and an order for 100,000 Rivian electric delivery vehicles — reflects an attempt to align corporate strategy with evolving social values (Peng and Meyer, 2019).</w:t>
+        <w:t>The World Health Organization (2023) links rising global obesity rates with ultra-processed food consumption, creating sustained reputational pressure on McDonald's to diversify and reformulate its menu. The McPlant burger — developed with Beyond Meat — targets the plant-based consumer segment. Ritzer (2019) argues that McDonaldization has shaped global consumer expectations for speed and convenience, creating both brand loyalty and critical scrutiny. Generation Z consumers increasingly evaluate purchasing choices against supply-chain sustainability and labour-practice standards, representing a structural social force demanding measurable corporate response.</w:t>
       </w:r>
     </w:p>
     <w:p>
@@ -1727,7 +1736,7 @@
           <w:i w:val="0"/>
           <w:sz w:val="22"/>
         </w:rPr>
-        <w:t>Cloud computing and generative artificial intelligence represent the most consequential technological forces shaping Amazon's trajectory. The global cloud infrastructure market continues to expand rapidly, driven by enterprise digital transformation and the emergence of large language models as mainstream business tools. Amazon has positioned AWS centrally within this opportunity through Amazon Bedrock — a managed service for deploying generative-AI models — and has integrated AI-driven automation across its fulfilment network. Amazon's research and development expenditure reached $85.6 billion in 2023, reflecting the organisation's recognition that technological leadership must be actively maintained to sustain its competitive position (Amazon, 2024).</w:t>
+        <w:t>Technology is McDonald's principal source of current efficiency gains and future competitive differentiation. Self-service kiosks deployed in over 80 per cent of global markets raise average order values through contextual upselling; Automated Order Taking pilots employ natural-language processing at drive-throughs (McDonald's Corporation, 2024). Blockchain supply-chain traceability pilots simultaneously address sustainability reporting and food safety obligations. Johnson et al. (2017) stress that technology must be aligned with organisational capability; poorly implemented AI risks customer dissatisfaction outcomes that negate the efficiency gains the investment was designed to deliver.</w:t>
       </w:r>
     </w:p>
     <w:p>
@@ -1753,7 +1762,7 @@
           <w:i w:val="0"/>
           <w:sz w:val="22"/>
         </w:rPr>
-        <w:t>Amazon's vast logistics network generates substantial greenhouse gas emissions, and its Scope 3 emissions — arising from the supply chains of the thousands of third-party sellers on its marketplace — are particularly challenging to quantify and reduce. In response, Amazon has become the world's largest corporate purchaser of renewable electricity and is deploying 100,000 electric delivery vehicles in partnership with Rivian. The EU's Corporate Sustainability Reporting Directive (CSRD) mandates detailed environmental disclosures for large organisations operating in Europe, increasing compliance obligations and creating reputational risk if reported progress falls short of publicly stated targets.</w:t>
+        <w:t>Beef production accounts for approximately 50 per cent of McDonald's Scope 3 greenhouse gas emissions — generated across its supply chain rather than in its own operations — making supplier decarbonisation both the largest climate challenge and the most difficult to directly control (McDonald's Corporation, 2024). McDonald's holds Science Based Targets initiative approval for a 36 per cent absolute emissions reduction by 2030 and net-zero by 2050. The EU Single-Use Plastics Directive and growing investor ESG scrutiny accelerate packaging and operational energy transition timelines across European and global markets.</w:t>
       </w:r>
     </w:p>
     <w:p>
@@ -1779,7 +1788,7 @@
           <w:i w:val="0"/>
           <w:sz w:val="22"/>
         </w:rPr>
-        <w:t>Amazon navigates a complex multi-jurisdictional legal environment. The EU's GDPR imposes penalties of up to four per cent of global annual turnover for material data protection violations; in 2021, Amazon received a record €746 million GDPR fine from Luxembourg's data protection authority. Labour law compliance varies significantly across operating countries, requiring localised policies and legal counsel. Intellectual property protection — particularly the challenge of preventing counterfeit goods from being listed on the marketplace — creates both direct legal liability and brand damage that undermines consumer confidence. These legal factors illustrate the interdependence of PESTEL dimensions: political regulation and social expectations crystallise into tangible legal obligations that Amazon must proactively manage.</w:t>
+        <w:t>McDonald's legal landscape spans employment law complexity — zero-hours contracts and TUPE provisions in the UK — and franchise law obligations across approximately 37,000 independent operators under diverse national frameworks. A 2021 data breach affecting US, South Korean, and Taiwanese systems exposed the organisation to GDPR risk of fines up to four per cent of global annual turnover, now disclosed as a principal risk factor (McDonald's Corporation, 2024). These obligations illustrate PESTEL interdependence: political decisions and social expectations crystallise into enforceable legal constraints that McDonald's must proactively manage.</w:t>
       </w:r>
     </w:p>
     <w:p>
@@ -1793,7 +1802,7 @@
           <w:i w:val="0"/>
           <w:sz w:val="22"/>
         </w:rPr>
-        <w:t>Table 2 summarises the six PESTEL dimensions and their principal implications for Amazon's global and local operations.</w:t>
+        <w:t>Table 2 summarises the six PESTEL dimensions and their implications for McDonald's across local and global operating contexts.</w:t>
       </w:r>
     </w:p>
     <w:tbl>
@@ -1869,7 +1878,7 @@
                 <w:color w:val="FFFFFF"/>
                 <w:sz w:val="20"/>
               </w:rPr>
-              <w:t>Local Context</w:t>
+              <w:t>Local Context (UK/EU)</w:t>
             </w:r>
           </w:p>
         </w:tc>
@@ -1932,7 +1941,7 @@
                 <w:b w:val="0"/>
                 <w:sz w:val="20"/>
               </w:rPr>
-              <w:t>DMA, antitrust, FDI rules</w:t>
+              <w:t>HFSS rules; OECD Pillar Two</w:t>
             </w:r>
           </w:p>
         </w:tc>
@@ -1952,7 +1961,7 @@
                 <w:b w:val="0"/>
                 <w:sz w:val="20"/>
               </w:rPr>
-              <w:t>EU/UK marketplace regulation</w:t>
+              <w:t>Advertising watershed + calorie labelling</w:t>
             </w:r>
           </w:p>
         </w:tc>
@@ -1972,7 +1981,7 @@
                 <w:b w:val="0"/>
                 <w:sz w:val="20"/>
               </w:rPr>
-              <w:t>US-China supply-chain risk</w:t>
+              <w:t>Brexit supply chain; Luxembourg IP structure</w:t>
             </w:r>
           </w:p>
         </w:tc>
@@ -2014,7 +2023,7 @@
                 <w:b w:val="0"/>
                 <w:sz w:val="20"/>
               </w:rPr>
-              <w:t>Inflation, currency, AWS margin</w:t>
+              <w:t>Commodity inflation; min. wage</w:t>
             </w:r>
           </w:p>
         </w:tc>
@@ -2034,7 +2043,7 @@
                 <w:b w:val="0"/>
                 <w:sz w:val="20"/>
               </w:rPr>
-              <w:t>Consumer spend compressed (UK/EU)</w:t>
+              <w:t>UK NLW £11.44/hr from April 2024</w:t>
             </w:r>
           </w:p>
         </w:tc>
@@ -2054,7 +2063,7 @@
                 <w:b w:val="0"/>
                 <w:sz w:val="20"/>
               </w:rPr>
-              <w:t>AWS = 67% operating income</w:t>
+              <w:t>$23.2B revenue; franchise margin buffer</w:t>
             </w:r>
           </w:p>
         </w:tc>
@@ -2096,7 +2105,7 @@
                 <w:b w:val="0"/>
                 <w:sz w:val="20"/>
               </w:rPr>
-              <w:t>Labour rights, sustainability</w:t>
+              <w:t>Obesity; plant-based; Gen Z ethics</w:t>
             </w:r>
           </w:p>
         </w:tc>
@@ -2116,7 +2125,7 @@
                 <w:b w:val="0"/>
                 <w:sz w:val="20"/>
               </w:rPr>
-              <w:t>UK/DE warehouse strikes</w:t>
+              <w:t>McPlant burger; HFSS consumer scrutiny</w:t>
             </w:r>
           </w:p>
         </w:tc>
@@ -2136,7 +2145,7 @@
                 <w:b w:val="0"/>
                 <w:sz w:val="20"/>
               </w:rPr>
-              <w:t>200M+ Prime subscribers</w:t>
+              <w:t>69M daily customers; Halal menus globally</w:t>
             </w:r>
           </w:p>
         </w:tc>
@@ -2178,7 +2187,7 @@
                 <w:b w:val="0"/>
                 <w:sz w:val="20"/>
               </w:rPr>
-              <w:t>Cloud, GenAI, $85.6B R&amp;D</w:t>
+              <w:t>AOT AI; kiosks; blockchain traceability</w:t>
             </w:r>
           </w:p>
         </w:tc>
@@ -2198,7 +2207,7 @@
                 <w:b w:val="0"/>
                 <w:sz w:val="20"/>
               </w:rPr>
-              <w:t>EU data-sovereignty zones</w:t>
+              <w:t>Kiosks in 80%+ of UK/EU restaurants</w:t>
             </w:r>
           </w:p>
         </w:tc>
@@ -2218,7 +2227,7 @@
                 <w:b w:val="0"/>
                 <w:sz w:val="20"/>
               </w:rPr>
-              <w:t>Amazon Bedrock globally</w:t>
+              <w:t>McDelivery via Uber Eats in 100+ countries</w:t>
             </w:r>
           </w:p>
         </w:tc>
@@ -2260,7 +2269,7 @@
                 <w:b w:val="0"/>
                 <w:sz w:val="20"/>
               </w:rPr>
-              <w:t>Net-zero 2040, CSRD, Rivian EVs</w:t>
+              <w:t>50% Scope 3 from beef; net-zero 2050</w:t>
             </w:r>
           </w:p>
         </w:tc>
@@ -2280,7 +2289,7 @@
                 <w:b w:val="0"/>
                 <w:sz w:val="20"/>
               </w:rPr>
-              <w:t>EU CSRD disclosure obligations</w:t>
+              <w:t>EU Single-Use Plastics Directive</w:t>
             </w:r>
           </w:p>
         </w:tc>
@@ -2300,7 +2309,7 @@
                 <w:b w:val="0"/>
                 <w:sz w:val="20"/>
               </w:rPr>
-              <w:t>World's largest renewable buyer</w:t>
+              <w:t>SBTi-approved 36% emissions cut by 2030</w:t>
             </w:r>
           </w:p>
         </w:tc>
@@ -2342,7 +2351,7 @@
                 <w:b w:val="0"/>
                 <w:sz w:val="20"/>
               </w:rPr>
-              <w:t>GDPR, labour law, IP/counterfeit</w:t>
+              <w:t>GDPR; franchise law; employment law</w:t>
             </w:r>
           </w:p>
         </w:tc>
@@ -2362,7 +2371,7 @@
                 <w:b w:val="0"/>
                 <w:sz w:val="20"/>
               </w:rPr>
-              <w:t>€746M GDPR fine (2021)</w:t>
+              <w:t>TUPE + zero-hours contract regulation</w:t>
             </w:r>
           </w:p>
         </w:tc>
@@ -2382,7 +2391,7 @@
                 <w:b w:val="0"/>
                 <w:sz w:val="20"/>
               </w:rPr>
-              <w:t>FTC antitrust suit (2023)</w:t>
+              <w:t>~37,000 franchisees; GDPR up to 4% turnover</w:t>
             </w:r>
           </w:p>
         </w:tc>
@@ -2398,7 +2407,7 @@
           <w:b/>
           <w:sz w:val="20"/>
         </w:rPr>
-        <w:t>Table 2: PESTEL Analysis Summary — Amazon Inc.</w:t>
+        <w:t>Table 2: PESTEL Analysis Summary — McDonald's Corporation</w:t>
       </w:r>
     </w:p>
     <w:p>
@@ -2424,7 +2433,7 @@
           <w:i w:val="0"/>
           <w:sz w:val="22"/>
         </w:rPr>
-        <w:t>This case study has examined Amazon's external business environment from two complementary perspectives. Task 1 identified eight business challenges across entrepreneurial, social, political, and technological dimensions. Antitrust scrutiny, labour rights concerns, and cybersecurity vulnerabilities were assessed as carrying the highest combined importance and impact, given their potential to trigger structural changes to Amazon's business model or to fundamentally undermine stakeholder trust.</w:t>
+        <w:t>This case study has examined McDonald's Corporation's external business environment from two complementary perspectives. Task 1 identified eight challenges across four dimensions: health and nutrition concerns were assessed as Very High in importance, as they drive regulatory restrictions that directly limit marketing reach and menu freedom. Labour rights, digital transformation, AI integration, and food advertising regulation were each ranked High, reflecting their combined capacity to reshape operational costs, competitive positioning, and brand legitimacy.</w:t>
       </w:r>
     </w:p>
     <w:p>
@@ -2438,7 +2447,7 @@
           <w:i w:val="0"/>
           <w:sz w:val="22"/>
         </w:rPr>
-        <w:t>The PESTEL analysis in Task 2 demonstrated that no factor operates independently. Political regulatory developments are a product of social attitudes towards platform concentration; AI advances simultaneously generate economic opportunity and social concern; environmental commitments intersect with emerging legal disclosure requirements. Amazon's long-term sustainability therefore depends on its ability to monitor and respond to these interconnected external forces as an integrated whole — rather than addressing each in isolation. Frameworks such as PESTEL equip organisations to develop this systemic understanding, which is a prerequisite for durable competitive advantage in the global marketplace (Peng and Meyer, 2019).</w:t>
+        <w:t>The PESTEL analysis confirmed that no factor operates independently. Social attitudes towards health crystallise into political HFSS regulation, which in turn imposes legal compliance obligations and constrains marketing strategy. Technological investment in AI ordering addresses economic efficiency imperatives while simultaneously creating cybersecurity and data privacy legal risks. Environmental commitments to reduce beef Scope 3 emissions respond to both investor ESG expectations and the EU's emerging legal disclosure requirements. Ritzer (2019) argues that McDonald's has shaped global consumer culture; the PESTEL analysis demonstrates that global forces are now reciprocally reshaping McDonald's. Peng and Meyer (2019) contend that organisations equipped to systematically analyse external forces are best positioned to convert environmental complexity into sustained strategic advantage.</w:t>
       </w:r>
     </w:p>
     <w:p>
@@ -2460,7 +2469,7 @@
     </w:p>
     <w:p>
       <w:pPr>
-        <w:spacing w:after="100"/>
+        <w:spacing w:after="120"/>
         <w:ind w:left="576" w:hanging="576"/>
         <w:jc w:val="both"/>
       </w:pPr>
@@ -2468,12 +2477,12 @@
         <w:rPr>
           <w:sz w:val="21"/>
         </w:rPr>
-        <w:t>Amazon (2024) Amazon Annual Report 2023. Seattle: Amazon.com, Inc. Available at: https://ir.aboutamazon.com/annual-reports (Accessed: 10 June 2026).</w:t>
+        <w:t>BBC News (2024) 'McDonald's workers in UK stage strikes over pay and conditions', BBC News, 20 May. Available at: https://www.bbc.co.uk/news/business (Accessed: 12 June 2026).</w:t>
       </w:r>
     </w:p>
     <w:p>
       <w:pPr>
-        <w:spacing w:after="100"/>
+        <w:spacing w:after="120"/>
         <w:ind w:left="576" w:hanging="576"/>
         <w:jc w:val="both"/>
       </w:pPr>
@@ -2481,12 +2490,12 @@
         <w:rPr>
           <w:sz w:val="21"/>
         </w:rPr>
-        <w:t>European Commission (2022) Antitrust: Commission sends Statement of Objections to Amazon for use of non-public independent seller data and opens second investigation into Amazon's e-commerce business practices. Brussels: European Commission. Available at: https://ec.europa.eu/commission/presscorner/detail/en/IP_22_7332 (Accessed: 10 June 2026).</w:t>
+        <w:t>Johnson, G., Whittington, R., Scholes, K., Angwin, D. and Regnér, P. (2017) Exploring Strategy: Text and Cases. 11th edn. Harlow: Pearson Education.</w:t>
       </w:r>
     </w:p>
     <w:p>
       <w:pPr>
-        <w:spacing w:after="100"/>
+        <w:spacing w:after="120"/>
         <w:ind w:left="576" w:hanging="576"/>
         <w:jc w:val="both"/>
       </w:pPr>
@@ -2494,12 +2503,12 @@
         <w:rPr>
           <w:sz w:val="21"/>
         </w:rPr>
-        <w:t>Kantor, J., Weise, K. and Ashford, G. (2021) 'The Amazon that customers don't see', The New York Times, 15 June. Available at: https://www.nytimes.com/interactive/2021/06/15/us/amazon-warehouse-workers.html (Accessed: 10 June 2026).</w:t>
+        <w:t>McDonald's Corporation (2024) 2023 Annual Report. Oak Brook, IL: McDonald's Corporation. Available at: https://corporate.mcdonalds.com/corpmcd/investors.html (Accessed: 12 June 2026).</w:t>
       </w:r>
     </w:p>
     <w:p>
       <w:pPr>
-        <w:spacing w:after="100"/>
+        <w:spacing w:after="120"/>
         <w:ind w:left="576" w:hanging="576"/>
         <w:jc w:val="both"/>
       </w:pPr>
@@ -2512,7 +2521,33 @@
     </w:p>
     <w:p>
       <w:pPr>
-        <w:spacing w:after="100"/>
+        <w:spacing w:after="120"/>
+        <w:ind w:left="576" w:hanging="576"/>
+        <w:jc w:val="both"/>
+      </w:pPr>
+      <w:r>
+        <w:rPr>
+          <w:sz w:val="21"/>
+        </w:rPr>
+        <w:t>Ritzer, G. (2019) The McDonaldization of Society. 9th edn. Thousand Oaks, CA: SAGE Publications.</w:t>
+      </w:r>
+    </w:p>
+    <w:p>
+      <w:pPr>
+        <w:spacing w:after="120"/>
+        <w:ind w:left="576" w:hanging="576"/>
+        <w:jc w:val="both"/>
+      </w:pPr>
+      <w:r>
+        <w:rPr>
+          <w:sz w:val="21"/>
+        </w:rPr>
+        <w:t>World Health Organization (2023) Obesity and Overweight [Fact sheet]. Geneva: WHO. Available at: https://www.who.int/news-room/fact-sheets/detail/obesity-and-overweight (Accessed: 12 June 2026).</w:t>
+      </w:r>
+    </w:p>
+    <w:p>
+      <w:pPr>
+        <w:spacing w:after="120"/>
         <w:ind w:left="576" w:hanging="576"/>
         <w:jc w:val="both"/>
       </w:pPr>

</xml_diff>